<commit_message>
Protocolos obligatorios por estudio: el Word se bloquea si falta alguna estructura
Co-Authored-By: Claude Opus 5.5 <noreply@anthropic.com>
Claude-Session: https://claude.ai/code/session_01UdPaAjDEXLYCAXPxWieUaS
</commit_message>
<xml_diff>
--- a/InformesHospital/Ejemplo_detallado_hospital.docx
+++ b/InformesHospital/Ejemplo_detallado_hospital.docx
@@ -381,7 +381,7 @@
                 <w:color w:val="111827"/>
                 <w:sz w:val="19"/>
               </w:rPr>
-              <w:t>10:22 AM</w:t>
+              <w:t>11:14 AM</w:t>
             </w:r>
           </w:p>
           <w:p>
@@ -833,27 +833,297 @@
               <w:t xml:space="preserve"> No se identifican colecciones peripancreáticas ni líquido en el espacio pararrenal anterior.</w:t>
             </w:r>
           </w:p>
+          <w:p>
+            <w:pPr>
+              <w:spacing w:before="100" w:after="40" w:line="259" w:lineRule="auto"/>
+              <w:shd w:val="clear" w:color="auto" w:fill="E8EEF7"/>
+              <w:keepNext/>
+              <w:pBdr>
+                <w:left w:val="single" w:sz="24" w:space="4" w:color="2E5C9A"/>
+              </w:pBdr>
+            </w:pPr>
+            <w:r>
+              <w:rPr>
+                <w:rFonts w:ascii="Arial" w:hAnsi="Arial" w:eastAsia="Arial"/>
+                <w:b/>
+                <w:i w:val="0"/>
+                <w:color w:val="1F3A5F"/>
+                <w:sz w:val="22"/>
+              </w:rPr>
+              <w:t>BAZO</w:t>
+            </w:r>
+          </w:p>
+          <w:p>
+            <w:pPr>
+              <w:spacing w:before="0" w:after="60" w:line="259" w:lineRule="auto"/>
+              <w:jc w:val="both"/>
+            </w:pPr>
+            <w:r>
+              <w:rPr>
+                <w:rFonts w:ascii="Arial" w:hAnsi="Arial" w:eastAsia="Arial"/>
+                <w:b w:val="0"/>
+                <w:i w:val="0"/>
+                <w:sz w:val="22"/>
+              </w:rPr>
+              <w:t>De situación habitual en el hipocondrio izquierdo, de forma y dimensiones conservadas, con contornos lisos y ecotextura homogénea.</w:t>
+            </w:r>
+            <w:r>
+              <w:rPr>
+                <w:rFonts w:ascii="Arial" w:hAnsi="Arial" w:eastAsia="Arial"/>
+                <w:b w:val="0"/>
+                <w:i w:val="0"/>
+                <w:sz w:val="22"/>
+              </w:rPr>
+              <w:t xml:space="preserve"> No se identifican lesiones focales sólidas ni quísticas, ni bazos accesorios.</w:t>
+            </w:r>
+            <w:r>
+              <w:rPr>
+                <w:rFonts w:ascii="Arial" w:hAnsi="Arial" w:eastAsia="Arial"/>
+                <w:b w:val="0"/>
+                <w:i w:val="0"/>
+                <w:sz w:val="22"/>
+              </w:rPr>
+              <w:t xml:space="preserve"> El hilio esplénico y la vena esplénica muestran calibre habitual.</w:t>
+            </w:r>
+          </w:p>
+          <w:p>
+            <w:pPr>
+              <w:spacing w:before="100" w:after="40" w:line="259" w:lineRule="auto"/>
+              <w:shd w:val="clear" w:color="auto" w:fill="E8EEF7"/>
+              <w:keepNext/>
+              <w:pBdr>
+                <w:left w:val="single" w:sz="24" w:space="4" w:color="2E5C9A"/>
+              </w:pBdr>
+            </w:pPr>
+            <w:r>
+              <w:rPr>
+                <w:rFonts w:ascii="Arial" w:hAnsi="Arial" w:eastAsia="Arial"/>
+                <w:b/>
+                <w:i w:val="0"/>
+                <w:color w:val="1F3A5F"/>
+                <w:sz w:val="22"/>
+              </w:rPr>
+              <w:t>RIÑÓN DERECHO</w:t>
+            </w:r>
+            <w:r>
+              <w:rPr>
+                <w:rFonts w:ascii="Arial" w:hAnsi="Arial" w:eastAsia="Arial"/>
+                <w:b/>
+                <w:i w:val="0"/>
+                <w:color w:val="C00000"/>
+                <w:sz w:val="16"/>
+              </w:rPr>
+              <w:t xml:space="preserve">   ● HALLAZGO RELEVANTE</w:t>
+            </w:r>
+          </w:p>
+          <w:p>
+            <w:pPr>
+              <w:spacing w:before="0" w:after="60" w:line="259" w:lineRule="auto"/>
+              <w:jc w:val="both"/>
+            </w:pPr>
+            <w:r>
+              <w:rPr>
+                <w:rFonts w:ascii="Arial" w:hAnsi="Arial" w:eastAsia="Arial"/>
+                <w:b w:val="0"/>
+                <w:i w:val="0"/>
+                <w:sz w:val="22"/>
+              </w:rPr>
+              <w:t xml:space="preserve">De situación habitual en la fosa renal, con </w:t>
+            </w:r>
+            <w:r>
+              <w:rPr>
+                <w:rFonts w:ascii="Arial" w:hAnsi="Arial" w:eastAsia="Arial"/>
+                <w:b/>
+                <w:i w:val="0"/>
+                <w:color w:val="C00000"/>
+                <w:sz w:val="22"/>
+              </w:rPr>
+              <w:t>alteración de su morfología</w:t>
+            </w:r>
+            <w:r>
+              <w:rPr>
+                <w:rFonts w:ascii="Arial" w:hAnsi="Arial" w:eastAsia="Arial"/>
+                <w:b w:val="0"/>
+                <w:i w:val="0"/>
+                <w:sz w:val="22"/>
+              </w:rPr>
+              <w:t xml:space="preserve"> y adelgazamiento del espesor cortical, con dimensiones y volumen consignados en el cuadro.</w:t>
+            </w:r>
+            <w:r>
+              <w:rPr>
+                <w:rFonts w:ascii="Arial" w:hAnsi="Arial" w:eastAsia="Arial"/>
+                <w:b w:val="0"/>
+                <w:i w:val="0"/>
+                <w:sz w:val="22"/>
+              </w:rPr>
+              <w:t xml:space="preserve"> La ecogenicidad cortical es habitual en relación con el parénquima hepático, mientras que la diferenciación corticomedular se encuentra disminuida.</w:t>
+            </w:r>
+          </w:p>
+          <w:p>
+            <w:pPr>
+              <w:spacing w:before="0" w:after="60" w:line="259" w:lineRule="auto"/>
+              <w:jc w:val="both"/>
+            </w:pPr>
+            <w:r>
+              <w:rPr>
+                <w:rFonts w:ascii="Arial" w:hAnsi="Arial" w:eastAsia="Arial"/>
+                <w:b w:val="0"/>
+                <w:i w:val="0"/>
+                <w:sz w:val="22"/>
+              </w:rPr>
+              <w:t xml:space="preserve">El sistema excretor presenta </w:t>
+            </w:r>
+            <w:r>
+              <w:rPr>
+                <w:rFonts w:ascii="Arial" w:hAnsi="Arial" w:eastAsia="Arial"/>
+                <w:b/>
+                <w:i w:val="0"/>
+                <w:color w:val="C00000"/>
+                <w:sz w:val="22"/>
+              </w:rPr>
+              <w:t>dilatación pielocalicial</w:t>
+            </w:r>
+            <w:r>
+              <w:rPr>
+                <w:rFonts w:ascii="Arial" w:hAnsi="Arial" w:eastAsia="Arial"/>
+                <w:b w:val="0"/>
+                <w:i w:val="0"/>
+                <w:sz w:val="22"/>
+              </w:rPr>
+              <w:t>, con ectasia de los cálices hasta 31.38 mm y de la pelvis renal hasta 18.12 mm, con cálices de aspecto redondeado y ensanchamiento de la pelvis extrarrenal.</w:t>
+            </w:r>
+            <w:r>
+              <w:rPr>
+                <w:rFonts w:ascii="Arial" w:hAnsi="Arial" w:eastAsia="Arial"/>
+                <w:b w:val="0"/>
+                <w:i w:val="0"/>
+                <w:sz w:val="22"/>
+              </w:rPr>
+              <w:t xml:space="preserve"> El segmento ureteral proximal no pudo ser definido en su trayecto, lo que impide precisar el nivel de la obstrucción.</w:t>
+            </w:r>
+            <w:r>
+              <w:rPr>
+                <w:rFonts w:ascii="Arial" w:hAnsi="Arial" w:eastAsia="Arial"/>
+                <w:b w:val="0"/>
+                <w:i w:val="0"/>
+                <w:sz w:val="22"/>
+              </w:rPr>
+              <w:t xml:space="preserve"> No se identifican imágenes de litiasis con sombra acústica posterior, quistes ni lesiones sólidas parenquimatosas, ni colecciones perirrenales.</w:t>
+            </w:r>
+          </w:p>
+          <w:p>
+            <w:pPr>
+              <w:spacing w:before="100" w:after="40" w:line="259" w:lineRule="auto"/>
+              <w:shd w:val="clear" w:color="auto" w:fill="E8EEF7"/>
+              <w:keepNext/>
+              <w:pBdr>
+                <w:left w:val="single" w:sz="24" w:space="4" w:color="2E5C9A"/>
+              </w:pBdr>
+            </w:pPr>
+            <w:r>
+              <w:rPr>
+                <w:rFonts w:ascii="Arial" w:hAnsi="Arial" w:eastAsia="Arial"/>
+                <w:b/>
+                <w:i w:val="0"/>
+                <w:color w:val="1F3A5F"/>
+                <w:sz w:val="22"/>
+              </w:rPr>
+              <w:t>RIÑÓN IZQUIERDO</w:t>
+            </w:r>
+          </w:p>
+          <w:p>
+            <w:pPr>
+              <w:spacing w:before="0" w:after="60" w:line="259" w:lineRule="auto"/>
+              <w:jc w:val="both"/>
+            </w:pPr>
+            <w:r>
+              <w:rPr>
+                <w:rFonts w:ascii="Arial" w:hAnsi="Arial" w:eastAsia="Arial"/>
+                <w:b w:val="0"/>
+                <w:i w:val="0"/>
+                <w:sz w:val="22"/>
+              </w:rPr>
+              <w:t>De situación, eje y forma conservados, con contornos lisos y dimensiones y volumen dentro de parámetros esperados.</w:t>
+            </w:r>
+            <w:r>
+              <w:rPr>
+                <w:rFonts w:ascii="Arial" w:hAnsi="Arial" w:eastAsia="Arial"/>
+                <w:b w:val="0"/>
+                <w:i w:val="0"/>
+                <w:sz w:val="22"/>
+              </w:rPr>
+              <w:t xml:space="preserve"> El espesor cortical está preservado, con ecogenicidad cortical habitual y diferenciación corticomedular conservada.</w:t>
+            </w:r>
+            <w:r>
+              <w:rPr>
+                <w:rFonts w:ascii="Arial" w:hAnsi="Arial" w:eastAsia="Arial"/>
+                <w:b w:val="0"/>
+                <w:i w:val="0"/>
+                <w:sz w:val="22"/>
+              </w:rPr>
+              <w:t xml:space="preserve"> El seno renal es de aspecto habitual y el sistema pielocalicial no muestra dilatación.</w:t>
+            </w:r>
+            <w:r>
+              <w:rPr>
+                <w:rFonts w:ascii="Arial" w:hAnsi="Arial" w:eastAsia="Arial"/>
+                <w:b w:val="0"/>
+                <w:i w:val="0"/>
+                <w:sz w:val="22"/>
+              </w:rPr>
+              <w:t xml:space="preserve"> No se identifican imágenes de litiasis, quistes ni lesiones focales sólidas, ni colecciones perirrenales.</w:t>
+            </w:r>
+          </w:p>
+          <w:p>
+            <w:pPr>
+              <w:spacing w:before="100" w:after="40" w:line="259" w:lineRule="auto"/>
+              <w:shd w:val="clear" w:color="auto" w:fill="E8EEF7"/>
+              <w:keepNext/>
+              <w:pBdr>
+                <w:left w:val="single" w:sz="24" w:space="4" w:color="2E5C9A"/>
+              </w:pBdr>
+            </w:pPr>
+            <w:r>
+              <w:rPr>
+                <w:rFonts w:ascii="Arial" w:hAnsi="Arial" w:eastAsia="Arial"/>
+                <w:b/>
+                <w:i w:val="0"/>
+                <w:color w:val="1F3A5F"/>
+                <w:sz w:val="22"/>
+              </w:rPr>
+              <w:t>URÉTERES</w:t>
+            </w:r>
+          </w:p>
+          <w:p>
+            <w:pPr>
+              <w:spacing w:before="0" w:after="60" w:line="259" w:lineRule="auto"/>
+              <w:jc w:val="both"/>
+            </w:pPr>
+            <w:r>
+              <w:rPr>
+                <w:rFonts w:ascii="Arial" w:hAnsi="Arial" w:eastAsia="Arial"/>
+                <w:b w:val="0"/>
+                <w:i w:val="0"/>
+                <w:sz w:val="22"/>
+              </w:rPr>
+              <w:t>El uréter proximal derecho no se logra definir en su trayecto, a pesar de la dilatación pielocalicial ipsilateral, por lo que no es posible precisar su calibre ni el nivel de la obstrucción.</w:t>
+            </w:r>
+          </w:p>
         </w:tc>
       </w:tr>
     </w:tbl>
     <w:p>
       <w:pPr>
-        <w:spacing w:before="100" w:after="40" w:line="259" w:lineRule="auto"/>
-        <w:shd w:val="clear" w:color="auto" w:fill="E8EEF7"/>
-        <w:keepNext/>
-        <w:pBdr>
-          <w:left w:val="single" w:sz="24" w:space="4" w:color="2E5C9A"/>
-        </w:pBdr>
+        <w:spacing w:before="0" w:after="60" w:line="259" w:lineRule="auto"/>
+        <w:jc w:val="both"/>
       </w:pPr>
       <w:r>
         <w:rPr>
           <w:rFonts w:ascii="Arial" w:hAnsi="Arial" w:eastAsia="Arial"/>
-          <w:b/>
+          <w:b w:val="0"/>
           <w:i w:val="0"/>
-          <w:color w:val="1F3A5F"/>
           <w:sz w:val="22"/>
         </w:rPr>
-        <w:t>BAZO</w:t>
+        <w:t>El uréter izquierdo no se visualiza dilatado en sus segmentos proximal y distal evaluables, lo que corresponde a un calibre conservado.</w:t>
       </w:r>
     </w:p>
     <w:p>
@@ -868,212 +1138,7 @@
           <w:i w:val="0"/>
           <w:sz w:val="22"/>
         </w:rPr>
-        <w:t>De situación habitual en el hipocondrio izquierdo, de forma y dimensiones conservadas, con contornos lisos y ecotextura homogénea.</w:t>
-      </w:r>
-      <w:r>
-        <w:rPr>
-          <w:rFonts w:ascii="Arial" w:hAnsi="Arial" w:eastAsia="Arial"/>
-          <w:b w:val="0"/>
-          <w:i w:val="0"/>
-          <w:sz w:val="22"/>
-        </w:rPr>
-        <w:t xml:space="preserve"> No se identifican lesiones focales sólidas ni quísticas, ni bazos accesorios.</w:t>
-      </w:r>
-      <w:r>
-        <w:rPr>
-          <w:rFonts w:ascii="Arial" w:hAnsi="Arial" w:eastAsia="Arial"/>
-          <w:b w:val="0"/>
-          <w:i w:val="0"/>
-          <w:sz w:val="22"/>
-        </w:rPr>
-        <w:t xml:space="preserve"> El hilio esplénico y la vena esplénica muestran calibre habitual.</w:t>
-      </w:r>
-    </w:p>
-    <w:p>
-      <w:pPr>
-        <w:spacing w:before="100" w:after="40" w:line="259" w:lineRule="auto"/>
-        <w:shd w:val="clear" w:color="auto" w:fill="E8EEF7"/>
-        <w:keepNext/>
-        <w:pBdr>
-          <w:left w:val="single" w:sz="24" w:space="4" w:color="2E5C9A"/>
-        </w:pBdr>
-      </w:pPr>
-      <w:r>
-        <w:rPr>
-          <w:rFonts w:ascii="Arial" w:hAnsi="Arial" w:eastAsia="Arial"/>
-          <w:b/>
-          <w:i w:val="0"/>
-          <w:color w:val="1F3A5F"/>
-          <w:sz w:val="22"/>
-        </w:rPr>
-        <w:t>RIÑÓN DERECHO</w:t>
-      </w:r>
-      <w:r>
-        <w:rPr>
-          <w:rFonts w:ascii="Arial" w:hAnsi="Arial" w:eastAsia="Arial"/>
-          <w:b/>
-          <w:i w:val="0"/>
-          <w:color w:val="C00000"/>
-          <w:sz w:val="16"/>
-        </w:rPr>
-        <w:t xml:space="preserve">   ● HALLAZGO RELEVANTE</w:t>
-      </w:r>
-    </w:p>
-    <w:p>
-      <w:pPr>
-        <w:spacing w:before="0" w:after="60" w:line="259" w:lineRule="auto"/>
-        <w:jc w:val="both"/>
-      </w:pPr>
-      <w:r>
-        <w:rPr>
-          <w:rFonts w:ascii="Arial" w:hAnsi="Arial" w:eastAsia="Arial"/>
-          <w:b w:val="0"/>
-          <w:i w:val="0"/>
-          <w:sz w:val="22"/>
-        </w:rPr>
-        <w:t xml:space="preserve">De situación habitual en la fosa renal, con </w:t>
-      </w:r>
-      <w:r>
-        <w:rPr>
-          <w:rFonts w:ascii="Arial" w:hAnsi="Arial" w:eastAsia="Arial"/>
-          <w:b/>
-          <w:i w:val="0"/>
-          <w:color w:val="C00000"/>
-          <w:sz w:val="22"/>
-        </w:rPr>
-        <w:t>alteración de su morfología</w:t>
-      </w:r>
-      <w:r>
-        <w:rPr>
-          <w:rFonts w:ascii="Arial" w:hAnsi="Arial" w:eastAsia="Arial"/>
-          <w:b w:val="0"/>
-          <w:i w:val="0"/>
-          <w:sz w:val="22"/>
-        </w:rPr>
-        <w:t xml:space="preserve"> y adelgazamiento del espesor cortical, con dimensiones y volumen consignados en el cuadro.</w:t>
-      </w:r>
-      <w:r>
-        <w:rPr>
-          <w:rFonts w:ascii="Arial" w:hAnsi="Arial" w:eastAsia="Arial"/>
-          <w:b w:val="0"/>
-          <w:i w:val="0"/>
-          <w:sz w:val="22"/>
-        </w:rPr>
-        <w:t xml:space="preserve"> La ecogenicidad cortical es habitual en relación con el parénquima hepático, mientras que la diferenciación corticomedular se encuentra disminuida.</w:t>
-      </w:r>
-    </w:p>
-    <w:p>
-      <w:pPr>
-        <w:spacing w:before="0" w:after="60" w:line="259" w:lineRule="auto"/>
-        <w:jc w:val="both"/>
-      </w:pPr>
-      <w:r>
-        <w:rPr>
-          <w:rFonts w:ascii="Arial" w:hAnsi="Arial" w:eastAsia="Arial"/>
-          <w:b w:val="0"/>
-          <w:i w:val="0"/>
-          <w:sz w:val="22"/>
-        </w:rPr>
-        <w:t xml:space="preserve">El sistema excretor presenta </w:t>
-      </w:r>
-      <w:r>
-        <w:rPr>
-          <w:rFonts w:ascii="Arial" w:hAnsi="Arial" w:eastAsia="Arial"/>
-          <w:b/>
-          <w:i w:val="0"/>
-          <w:color w:val="C00000"/>
-          <w:sz w:val="22"/>
-        </w:rPr>
-        <w:t>dilatación pielocalicial</w:t>
-      </w:r>
-      <w:r>
-        <w:rPr>
-          <w:rFonts w:ascii="Arial" w:hAnsi="Arial" w:eastAsia="Arial"/>
-          <w:b w:val="0"/>
-          <w:i w:val="0"/>
-          <w:sz w:val="22"/>
-        </w:rPr>
-        <w:t>, con ectasia de los cálices hasta 31.38 mm y de la pelvis renal hasta 18.12 mm, con cálices de aspecto redondeado y ensanchamiento de la pelvis extrarrenal.</w:t>
-      </w:r>
-      <w:r>
-        <w:rPr>
-          <w:rFonts w:ascii="Arial" w:hAnsi="Arial" w:eastAsia="Arial"/>
-          <w:b w:val="0"/>
-          <w:i w:val="0"/>
-          <w:sz w:val="22"/>
-        </w:rPr>
-        <w:t xml:space="preserve"> El segmento ureteral proximal no pudo ser definido en su trayecto, lo que impide precisar el nivel de la obstrucción.</w:t>
-      </w:r>
-      <w:r>
-        <w:rPr>
-          <w:rFonts w:ascii="Arial" w:hAnsi="Arial" w:eastAsia="Arial"/>
-          <w:b w:val="0"/>
-          <w:i w:val="0"/>
-          <w:sz w:val="22"/>
-        </w:rPr>
-        <w:t xml:space="preserve"> No se identifican imágenes de litiasis con sombra acústica posterior, quistes ni lesiones sólidas parenquimatosas, ni colecciones perirrenales.</w:t>
-      </w:r>
-    </w:p>
-    <w:p>
-      <w:pPr>
-        <w:spacing w:before="100" w:after="40" w:line="259" w:lineRule="auto"/>
-        <w:shd w:val="clear" w:color="auto" w:fill="E8EEF7"/>
-        <w:keepNext/>
-        <w:pBdr>
-          <w:left w:val="single" w:sz="24" w:space="4" w:color="2E5C9A"/>
-        </w:pBdr>
-      </w:pPr>
-      <w:r>
-        <w:rPr>
-          <w:rFonts w:ascii="Arial" w:hAnsi="Arial" w:eastAsia="Arial"/>
-          <w:b/>
-          <w:i w:val="0"/>
-          <w:color w:val="1F3A5F"/>
-          <w:sz w:val="22"/>
-        </w:rPr>
-        <w:t>RIÑÓN IZQUIERDO</w:t>
-      </w:r>
-    </w:p>
-    <w:p>
-      <w:pPr>
-        <w:spacing w:before="0" w:after="60" w:line="259" w:lineRule="auto"/>
-        <w:jc w:val="both"/>
-      </w:pPr>
-      <w:r>
-        <w:rPr>
-          <w:rFonts w:ascii="Arial" w:hAnsi="Arial" w:eastAsia="Arial"/>
-          <w:b w:val="0"/>
-          <w:i w:val="0"/>
-          <w:sz w:val="22"/>
-        </w:rPr>
-        <w:t>De situación, eje y forma conservados, con contornos lisos y dimensiones y volumen dentro de parámetros esperados.</w:t>
-      </w:r>
-      <w:r>
-        <w:rPr>
-          <w:rFonts w:ascii="Arial" w:hAnsi="Arial" w:eastAsia="Arial"/>
-          <w:b w:val="0"/>
-          <w:i w:val="0"/>
-          <w:sz w:val="22"/>
-        </w:rPr>
-        <w:t xml:space="preserve"> El espesor cortical está preservado, con ecogenicidad cortical habitual y diferenciación corticomedular conservada.</w:t>
-      </w:r>
-      <w:r>
-        <w:rPr>
-          <w:rFonts w:ascii="Arial" w:hAnsi="Arial" w:eastAsia="Arial"/>
-          <w:b w:val="0"/>
-          <w:i w:val="0"/>
-          <w:sz w:val="22"/>
-        </w:rPr>
-        <w:t xml:space="preserve"> El seno renal es de aspecto habitual y el sistema pielocalicial no muestra dilatación.</w:t>
-      </w:r>
-      <w:r>
-        <w:rPr>
-          <w:rFonts w:ascii="Arial" w:hAnsi="Arial" w:eastAsia="Arial"/>
-          <w:b w:val="0"/>
-          <w:i w:val="0"/>
-          <w:sz w:val="22"/>
-        </w:rPr>
-        <w:t xml:space="preserve"> No se identifican imágenes de litiasis, quistes ni lesiones focales sólidas, ni colecciones perirrenales.</w:t>
+        <w:t>No se identifican imágenes de litiasis con sombra acústica posterior en los segmentos ureterales accesibles ni en las regiones yuxtavesicales.</w:t>
       </w:r>
     </w:p>
     <w:p>
@@ -1184,6 +1249,156 @@
           <w:color w:val="1F3A5F"/>
           <w:sz w:val="22"/>
         </w:rPr>
+        <w:t>GLÁNDULAS SUPRARRENALES (REGIONES)</w:t>
+      </w:r>
+    </w:p>
+    <w:p>
+      <w:pPr>
+        <w:spacing w:before="0" w:after="60" w:line="259" w:lineRule="auto"/>
+        <w:jc w:val="both"/>
+      </w:pPr>
+      <w:r>
+        <w:rPr>
+          <w:rFonts w:ascii="Arial" w:hAnsi="Arial" w:eastAsia="Arial"/>
+          <w:b w:val="0"/>
+          <w:i w:val="0"/>
+          <w:sz w:val="22"/>
+        </w:rPr>
+        <w:t>Las regiones suprarrenales derecha e izquierda se exploran sin evidencia de masas sólidas ni quísticas, sin efecto de masa sobre los polos renales superiores ni sobre las estructuras vasculares adyacentes.</w:t>
+      </w:r>
+      <w:r>
+        <w:rPr>
+          <w:rFonts w:ascii="Arial" w:hAnsi="Arial" w:eastAsia="Arial"/>
+          <w:b w:val="0"/>
+          <w:i w:val="0"/>
+          <w:sz w:val="22"/>
+        </w:rPr>
+        <w:t xml:space="preserve"> Las glándulas no se individualizan como estructuras aumentadas de tamaño.</w:t>
+      </w:r>
+    </w:p>
+    <w:p>
+      <w:pPr>
+        <w:spacing w:before="100" w:after="40" w:line="259" w:lineRule="auto"/>
+        <w:shd w:val="clear" w:color="auto" w:fill="E8EEF7"/>
+        <w:keepNext/>
+        <w:pBdr>
+          <w:left w:val="single" w:sz="24" w:space="4" w:color="2E5C9A"/>
+        </w:pBdr>
+      </w:pPr>
+      <w:r>
+        <w:rPr>
+          <w:rFonts w:ascii="Arial" w:hAnsi="Arial" w:eastAsia="Arial"/>
+          <w:b/>
+          <w:i w:val="0"/>
+          <w:color w:val="1F3A5F"/>
+          <w:sz w:val="22"/>
+        </w:rPr>
+        <w:t>RETROPERITONEO Y GRANDES VASOS</w:t>
+      </w:r>
+    </w:p>
+    <w:p>
+      <w:pPr>
+        <w:spacing w:before="0" w:after="60" w:line="259" w:lineRule="auto"/>
+        <w:jc w:val="both"/>
+      </w:pPr>
+      <w:r>
+        <w:rPr>
+          <w:rFonts w:ascii="Arial" w:hAnsi="Arial" w:eastAsia="Arial"/>
+          <w:b w:val="0"/>
+          <w:i w:val="0"/>
+          <w:sz w:val="22"/>
+        </w:rPr>
+        <w:t>La aorta abdominal presenta calibre conservado y uniforme en sus segmentos visualizados, sin dilataciones aneurismáticas, placas groseras ni trombos murales.</w:t>
+      </w:r>
+      <w:r>
+        <w:rPr>
+          <w:rFonts w:ascii="Arial" w:hAnsi="Arial" w:eastAsia="Arial"/>
+          <w:b w:val="0"/>
+          <w:i w:val="0"/>
+          <w:sz w:val="22"/>
+        </w:rPr>
+        <w:t xml:space="preserve"> La vena cava inferior es permeable, de calibre habitual y con variación respiratoria conservada.</w:t>
+      </w:r>
+      <w:r>
+        <w:rPr>
+          <w:rFonts w:ascii="Arial" w:hAnsi="Arial" w:eastAsia="Arial"/>
+          <w:b w:val="0"/>
+          <w:i w:val="0"/>
+          <w:sz w:val="22"/>
+        </w:rPr>
+        <w:t xml:space="preserve"> No se identifican adenopatías retroperitoneales paraaórticas, aortocavas ni paracavas, ni colecciones en los espacios perirrenales y pararrenales anteriores y posteriores.</w:t>
+      </w:r>
+    </w:p>
+    <w:p>
+      <w:pPr>
+        <w:spacing w:before="100" w:after="40" w:line="259" w:lineRule="auto"/>
+        <w:shd w:val="clear" w:color="auto" w:fill="E8EEF7"/>
+        <w:keepNext/>
+        <w:pBdr>
+          <w:left w:val="single" w:sz="24" w:space="4" w:color="2E5C9A"/>
+        </w:pBdr>
+      </w:pPr>
+      <w:r>
+        <w:rPr>
+          <w:rFonts w:ascii="Arial" w:hAnsi="Arial" w:eastAsia="Arial"/>
+          <w:b/>
+          <w:i w:val="0"/>
+          <w:color w:val="1F3A5F"/>
+          <w:sz w:val="22"/>
+        </w:rPr>
+        <w:t>ASAS INTESTINALES Y PARED ABDOMINAL</w:t>
+      </w:r>
+    </w:p>
+    <w:p>
+      <w:pPr>
+        <w:spacing w:before="0" w:after="60" w:line="259" w:lineRule="auto"/>
+        <w:jc w:val="both"/>
+      </w:pPr>
+      <w:r>
+        <w:rPr>
+          <w:rFonts w:ascii="Arial" w:hAnsi="Arial" w:eastAsia="Arial"/>
+          <w:b w:val="0"/>
+          <w:i w:val="0"/>
+          <w:sz w:val="22"/>
+        </w:rPr>
+        <w:t>Las asas intestinales evaluables presentan calibre conservado, con peristaltismo presente, sin engrosamientos parietales, distensión ni contenido líquido anómalo.</w:t>
+      </w:r>
+      <w:r>
+        <w:rPr>
+          <w:rFonts w:ascii="Arial" w:hAnsi="Arial" w:eastAsia="Arial"/>
+          <w:b w:val="0"/>
+          <w:i w:val="0"/>
+          <w:sz w:val="22"/>
+        </w:rPr>
+        <w:t xml:space="preserve"> No se identifican imágenes en diana ni signos de obstrucción.</w:t>
+      </w:r>
+      <w:r>
+        <w:rPr>
+          <w:rFonts w:ascii="Arial" w:hAnsi="Arial" w:eastAsia="Arial"/>
+          <w:b w:val="0"/>
+          <w:i w:val="0"/>
+          <w:sz w:val="22"/>
+        </w:rPr>
+        <w:t xml:space="preserve"> La pared abdominal muestra planos cutáneo, subcutáneo, aponeurótico y muscular de espesor y ecoestructura habituales, sin defectos herniarios, colecciones ni lesiones focales en las regiones exploradas.</w:t>
+      </w:r>
+    </w:p>
+    <w:p>
+      <w:pPr>
+        <w:spacing w:before="100" w:after="40" w:line="259" w:lineRule="auto"/>
+        <w:shd w:val="clear" w:color="auto" w:fill="E8EEF7"/>
+        <w:keepNext/>
+        <w:pBdr>
+          <w:left w:val="single" w:sz="24" w:space="4" w:color="2E5C9A"/>
+        </w:pBdr>
+      </w:pPr>
+      <w:r>
+        <w:rPr>
+          <w:rFonts w:ascii="Arial" w:hAnsi="Arial" w:eastAsia="Arial"/>
+          <w:b/>
+          <w:i w:val="0"/>
+          <w:color w:val="1F3A5F"/>
+          <w:sz w:val="22"/>
+        </w:rPr>
         <w:t>ÚTERO</w:t>
       </w:r>
     </w:p>
@@ -1217,7 +1432,42 @@
           <w:i w:val="0"/>
           <w:sz w:val="22"/>
         </w:rPr>
-        <w:t xml:space="preserve"> El endometrio es fino, lineal y regular, de 3.38 mm, con cavidad endometrial libre, sin colecciones ni lesiones ocupantes.</w:t>
+        <w:t xml:space="preserve"> No se identifican lesiones focales miometriales ni áreas de adenomiosis.</w:t>
+      </w:r>
+    </w:p>
+    <w:p>
+      <w:pPr>
+        <w:spacing w:before="100" w:after="40" w:line="259" w:lineRule="auto"/>
+        <w:shd w:val="clear" w:color="auto" w:fill="E8EEF7"/>
+        <w:keepNext/>
+        <w:pBdr>
+          <w:left w:val="single" w:sz="24" w:space="4" w:color="2E5C9A"/>
+        </w:pBdr>
+      </w:pPr>
+      <w:r>
+        <w:rPr>
+          <w:rFonts w:ascii="Arial" w:hAnsi="Arial" w:eastAsia="Arial"/>
+          <w:b/>
+          <w:i w:val="0"/>
+          <w:color w:val="1F3A5F"/>
+          <w:sz w:val="22"/>
+        </w:rPr>
+        <w:t>ENDOMETRIO</w:t>
+      </w:r>
+    </w:p>
+    <w:p>
+      <w:pPr>
+        <w:spacing w:before="0" w:after="60" w:line="259" w:lineRule="auto"/>
+        <w:jc w:val="both"/>
+      </w:pPr>
+      <w:r>
+        <w:rPr>
+          <w:rFonts w:ascii="Arial" w:hAnsi="Arial" w:eastAsia="Arial"/>
+          <w:b w:val="0"/>
+          <w:i w:val="0"/>
+          <w:sz w:val="22"/>
+        </w:rPr>
+        <w:t>El endometrio es fino, lineal y regular, de 3.38 mm de espesor, de ecogenicidad homogénea, con línea media central y bien definida.</w:t>
       </w:r>
       <w:r>
         <w:rPr>
@@ -1226,7 +1476,69 @@
           <w:i w:val="0"/>
           <w:sz w:val="22"/>
         </w:rPr>
-        <w:t xml:space="preserve"> El cérvix es de morfología habitual en lo evaluable.</w:t>
+        <w:t xml:space="preserve"> La interfase endometrio-miometrio es nítida y regular.</w:t>
+      </w:r>
+      <w:r>
+        <w:rPr>
+          <w:rFonts w:ascii="Arial" w:hAnsi="Arial" w:eastAsia="Arial"/>
+          <w:b w:val="0"/>
+          <w:i w:val="0"/>
+          <w:sz w:val="22"/>
+        </w:rPr>
+        <w:t xml:space="preserve"> La cavidad endometrial se encuentra libre, sin colecciones, pólipos ni lesiones ocupantes, y no se identifican dispositivos intrauterinos.</w:t>
+      </w:r>
+    </w:p>
+    <w:p>
+      <w:pPr>
+        <w:spacing w:before="100" w:after="40" w:line="259" w:lineRule="auto"/>
+        <w:shd w:val="clear" w:color="auto" w:fill="E8EEF7"/>
+        <w:keepNext/>
+        <w:pBdr>
+          <w:left w:val="single" w:sz="24" w:space="4" w:color="2E5C9A"/>
+        </w:pBdr>
+      </w:pPr>
+      <w:r>
+        <w:rPr>
+          <w:rFonts w:ascii="Arial" w:hAnsi="Arial" w:eastAsia="Arial"/>
+          <w:b/>
+          <w:i w:val="0"/>
+          <w:color w:val="1F3A5F"/>
+          <w:sz w:val="22"/>
+        </w:rPr>
+        <w:t>CÉRVIX</w:t>
+      </w:r>
+    </w:p>
+    <w:p>
+      <w:pPr>
+        <w:spacing w:before="0" w:after="60" w:line="259" w:lineRule="auto"/>
+        <w:jc w:val="both"/>
+      </w:pPr>
+      <w:r>
+        <w:rPr>
+          <w:rFonts w:ascii="Arial" w:hAnsi="Arial" w:eastAsia="Arial"/>
+          <w:b w:val="0"/>
+          <w:i w:val="0"/>
+          <w:sz w:val="22"/>
+        </w:rPr>
+        <w:t>El cuello uterino es de morfología y dimensiones habituales, con estroma de ecogenicidad homogénea y contornos regulares.</w:t>
+      </w:r>
+      <w:r>
+        <w:rPr>
+          <w:rFonts w:ascii="Arial" w:hAnsi="Arial" w:eastAsia="Arial"/>
+          <w:b w:val="0"/>
+          <w:i w:val="0"/>
+          <w:sz w:val="22"/>
+        </w:rPr>
+        <w:t xml:space="preserve"> El canal endocervical es lineal y no se encuentra dilatado.</w:t>
+      </w:r>
+      <w:r>
+        <w:rPr>
+          <w:rFonts w:ascii="Arial" w:hAnsi="Arial" w:eastAsia="Arial"/>
+          <w:b w:val="0"/>
+          <w:i w:val="0"/>
+          <w:sz w:val="22"/>
+        </w:rPr>
+        <w:t xml:space="preserve"> No se identifican quistes de Naboth de tamaño significativo, masas cervicales ni extensión parametrial evidente en lo evaluable por vía transabdominal.</w:t>
       </w:r>
     </w:p>
     <w:p>
@@ -1352,7 +1664,7 @@
           <w:color w:val="1F3A5F"/>
           <w:sz w:val="22"/>
         </w:rPr>
-        <w:t>ANEXOS, ESPACIO DE DOUGLAS Y CAVIDAD PERITONEAL</w:t>
+        <w:t>REGIONES ANEXIALES, ESPACIO DE DOUGLAS Y CAVIDAD PERITONEAL</w:t>
       </w:r>
     </w:p>
     <w:p>
@@ -1376,7 +1688,7 @@
           <w:i w:val="0"/>
           <w:sz w:val="22"/>
         </w:rPr>
-        <w:t xml:space="preserve"> No se identifica líquido libre en el espacio de Douglas ni en los recesos peritoneales evaluados.</w:t>
+        <w:t xml:space="preserve"> No se identifica líquido libre en el espacio de Douglas, en los espacios hepatorrenal (Morison) y esplenorrenal, ni en las goteras parietocólicas.</w:t>
       </w:r>
       <w:r>
         <w:rPr>
@@ -1385,7 +1697,7 @@
           <w:i w:val="0"/>
           <w:sz w:val="22"/>
         </w:rPr>
-        <w:t xml:space="preserve"> No se observan colecciones, adenopatías retroperitoneales accesibles ni alteraciones del calibre de la aorta abdominal y de la vena cava inferior en sus segmentos visualizados.</w:t>
+        <w:t xml:space="preserve"> No se observan colecciones intraperitoneales ni extraperitoneales, implantes peritoneales ni engrosamiento del omento en las regiones exploradas.</w:t>
       </w:r>
     </w:p>
     <w:p>

</xml_diff>

<commit_message>
La firma nunca queda sola en una página
Co-Authored-By: Claude Opus 5.5 <noreply@anthropic.com>
Claude-Session: https://claude.ai/code/session_01UdPaAjDEXLYCAXPxWieUaS
</commit_message>
<xml_diff>
--- a/InformesHospital/Ejemplo_detallado_hospital.docx
+++ b/InformesHospital/Ejemplo_detallado_hospital.docx
@@ -381,7 +381,7 @@
                 <w:color w:val="111827"/>
                 <w:sz w:val="19"/>
               </w:rPr>
-              <w:t>11:14 AM</w:t>
+              <w:t>11:15 AM</w:t>
             </w:r>
           </w:p>
           <w:p>
@@ -3967,6 +3967,7 @@
     </w:p>
     <w:p>
       <w:pPr>
+        <w:keepNext/>
         <w:spacing w:before="0" w:after="60" w:line="259" w:lineRule="auto"/>
         <w:jc w:val="both"/>
       </w:pPr>
@@ -4001,7 +4002,7 @@
     <w:p>
       <w:pPr>
         <w:keepNext/>
-        <w:spacing w:before="520" w:after="0" w:line="259" w:lineRule="auto"/>
+        <w:spacing w:before="400" w:after="0" w:line="259" w:lineRule="auto"/>
         <w:jc w:val="center"/>
       </w:pPr>
       <w:r>

</xml_diff>